<commit_message>
Apply academic and COMPAG copyediting while preserving verified scientific outputs
</commit_message>
<xml_diff>
--- a/revision/deliverables/Manuscript_CLEAN.docx
+++ b/revision/deliverables/Manuscript_CLEAN.docx
@@ -7,7 +7,7 @@
         <w:pStyle w:val="Title"/>
       </w:pPr>
       <w:r>
-        <w:t>Reassessing the reported increase in asthma mortality in Brazil: reproduction and age-specific reanalysis, 2014–2021</w:t>
+        <w:t>Reassessing asthma mortality in Brazil during 2014–2021 through reproduction and age-specific analysis</w:t>
       </w:r>
     </w:p>
     <w:p>
@@ -22,7 +22,7 @@
     </w:p>
     <w:p>
       <w:r>
-        <w:t>Correspondence: Francisco Federico García Crespi, fedeg@umh.es. Author details and declarations are carried forward from the reviewed PDF for confirmation in the accompanying author checklist.</w:t>
+        <w:t>Correspondence. Francisco Federico García Crespi, fedeg@umh.es. Author details and declarations are retained from the reviewed PDF and require confirmation in the accompanying checklist.</w:t>
       </w:r>
     </w:p>
     <w:p>
@@ -35,27 +35,27 @@
     </w:p>
     <w:p>
       <w:r>
-        <w:t>Objective: To assess whether the reported crude increase in Brazilian asthma mortality during 2014–2021 persists after age standardisation in the national domain of completed ages ≥7, and to examine mortality within ages 5–34.</w:t>
+        <w:t>Objective. To assess whether the reported increase in crude asthma mortality in Brazil during 2014–2021 persists after age standardisation among people aged ≥7 years, and to examine mortality within ages 5–34.</w:t>
       </w:r>
     </w:p>
     <w:p>
       <w:r>
-        <w:t>Methods: We reproduced the historical pipeline, then corrected age to completed calendar years, included U071 in COVID exclusions, and retained an ambiguous pair of 2018 records. Primary denominators were IBGE 2018 and the fixed standard was Brazil 2014, normalised within each domain. IBGE 2024, WHO standardisation, count models, alternative selection rules and pandemic-period restrictions were sensitivity analyses.</w:t>
+        <w:t>Methods. We reproduced the historical analysis and revised record selection using completed calendar age, COVID exclusions including U071, and retention of two 2018 records whose identity could not be established. The primary analysis used IBGE 2018 denominators and Brazil 2014 standard weights, normalised within each age range. Sensitivities examined IBGE 2024, WHO weights, count models, alternative selection rules and pandemic-period restrictions.</w:t>
       </w:r>
     </w:p>
     <w:p>
       <w:r>
-        <w:t>Results: Historical selection reproduced 18,583 deaths with continuous age &gt;6, versus 18,584 published. The corrected national analysis of completed ages ≥7 included 18,544 deaths: aligned crude mortality increased 12.0%, whereas Brazil-2014-standardised mortality changed -4.1% between endpoints (eight-year slope 0.0002; 95% CI -0.0214 to 0.0217; p = 0.986). Within ages 5–34, Brazil-2014-standardised mortality increased 18.0% (0.0328 per 100,000; p = 0.018). Its slope remained positive excluding 2020 (p = 0.040); the 2014–2019 interval included zero (p = 0.107).</w:t>
+        <w:t>Results. Historical selection reproduced 18,583 deaths with continuous age &gt;6; the published count was 18,584. The corrected national analysis of completed ages ≥7 included 18,544 deaths. Aligned crude mortality increased 12.0%; Brazil-2014-standardised mortality changed -4.1% between endpoints (eight-year slope 0.0002; 95% CI -0.0214 to 0.0217; p = 0.986). Within ages 5–34, Brazil-2014-standardised mortality increased 18.0% (0.0328 per 100,000; p = 0.018). Its slope remained positive excluding 2020 (p = 0.040); the 2014–2019 interval included zero (p = 0.107).</w:t>
       </w:r>
     </w:p>
     <w:p>
       <w:r>
-        <w:t>Conclusion: Changes in population age composition accounted for much of the crude increase at ages ≥7, without a causal attribution. The primary national age-standardised estimate did not establish an increasing trend or demonstrate stability. Within-5–34 standardisation supported an increase across 2014–2021, including after excluding 2020; the shorter prepandemic series was inconclusive about the annual trend. Surveillance should report crude, age-standardised and age-specific rates jointly.</w:t>
+        <w:t>Conclusion. Changes in population age composition accounted for much of the crude increase at ages ≥7 in a descriptive decomposition. The primary national age-standardised estimate was compatible with trends in either direction. Standardisation within 5–34 supported an increase over 2014–2021 and after excluding 2020; the shorter prepandemic series remained inconclusive about the annual trend. Surveillance should report crude, age-standardised and age-specific rates together.</w:t>
       </w:r>
     </w:p>
     <w:p>
       <w:r>
-        <w:t>Keywords: Asthma; Mortality; Age Distribution; Population Dynamics; Reproducibility of Results; Brazil.</w:t>
+        <w:t>Keywords. Asthma; Mortality; Age Distribution; Population Dynamics; Reproducibility of Results; Brazil.</w:t>
       </w:r>
     </w:p>
     <w:p>
@@ -68,22 +68,22 @@
     </w:p>
     <w:p>
       <w:r>
-        <w:t>Brum et al. concluded that "asthma mortality remains high and shows an increasing trend for the first time in the past decades" [1]. Their nationwide analysis for 2014–2021 identified 18,584 asthma deaths and reported an approximately 2.5% annual increase in asthma mortality. A subsequent study by Cardoso et al., covering 2013–2023, also concluded that asthma-related deaths had increased [2]. However, this conclusion was based on annual death counts, while the same study reported that the overall mortality rate per 100,000 inhabitants remained stable. Thus, the two studies described increasing asthma mortality using different measures, neither of which established an increase in the national age-standardised rate.</w:t>
+        <w:t>Brum et al. concluded that "asthma mortality remains high and shows an increasing trend for the first time in the past decades" [1]. Their nationwide analysis for 2014–2021 identified 18,584 asthma deaths and reported an annual increase of approximately 2.5%. Cardoso et al., studying 2013–2023, also concluded that asthma-related deaths had increased [2]. They based this conclusion on annual death counts and reported a stable overall mortality rate per 100,000 inhabitants. These measures describe different aspects of mortality. Neither establishes an increase in the national age-standardised rate.</w:t>
       </w:r>
     </w:p>
     <w:p>
       <w:r>
-        <w:t>Earlier Brazilian surveillance provides a longer perspective. Graudenz et al. reported a linear decline in age-standardised asthma mortality among Brazilians aged 5–34 years during 1980–2014, whereas the trend in the general population was non-linear [3]. Differences in study periods, age ranges and rate definitions prevent direct comparison with more recent estimates or the identification of a historical trend reversal.</w:t>
+        <w:t>Earlier Brazilian surveillance offers a longer perspective. Graudenz et al. reported a linear decline in age-standardised asthma mortality among people aged 5–34 during 1980–2014 and a non-linear trend in the general population [3]. Differences in periods, age ranges and rate definitions limit direct comparison with recent estimates and prevent identification of a historical trend reversal.</w:t>
       </w:r>
     </w:p>
     <w:p>
       <w:r>
-        <w:t>Neither Brum et al. nor Cardoso et al. directly age-standardised the national mortality series. This omission matters because approximately two thirds of asthma deaths occurred among individuals aged 60 years or older [1,2], and changes in population age structure can affect crude mortality rates independently of changes in age-specific mortality. Consequently, an increase in deaths or crude mortality cannot, by itself, establish a comparable increase in age-adjusted mortality. The public availability of Brum et al.'s analytical code [4] also makes it possible to examine the reproducibility of their case selection, population denominators and trend estimates before reassessing the interpretation.</w:t>
+        <w:t>Population ageing is relevant to this comparison because approximately two thirds of asthma deaths occurred among people aged ≥60 [1,2]. Changes in age composition can raise crude mortality even when age-specific rates do not increase. Neither Brum et al. nor Cardoso et al. directly age-standardised the national series. Brum et al.'s public code [4] provides an opportunity to examine case selection, population denominators and trend estimates before reassessing the mortality pattern.</w:t>
       </w:r>
     </w:p>
     <w:p>
       <w:r>
-        <w:t>We therefore asked to what extent the reported increase in asthma mortality in Brazil during 2014–2021 remains supported when the original analysis is reproduced and population age structure is held fixed. We first reproduced Brum et al.'s analysis and documented agreements and discrepancies with the published results. We then estimated national age-standardised mortality trends and examined mortality among individuals aged 5–34 years. In post hoc robustness analyses, we assessed an alternative population projection, the WHO standard population and count regression models. Our objective was not to dispute the observed increase in crude mortality, but to establish which epidemiological interpretations are supported after accounting for population age structure and examining age-specific trends.</w:t>
+        <w:t>We examined whether the reported increase in Brazilian asthma mortality during 2014–2021 persisted when population age structure was held fixed. We first reproduced Brum et al.'s analysis and documented agreements and discrepancies with the published results. We then estimated national rates among people aged ≥7 years and rates within ages 5–34, standardising separately within each range. Post hoc sensitivity analyses examined alternative population projections, WHO weights, count models, selection rules and pandemic-period restrictions. These analyses distinguish the observed crude increase from the national and age-specific trends supported by the data.</w:t>
       </w:r>
     </w:p>
     <w:p>
@@ -104,12 +104,12 @@
     </w:p>
     <w:p>
       <w:r>
-        <w:t>This secondary, ecological analysis reassessed national underlying-cause asthma mortality in Brazil, 2014–2021. The national corrected primary domain was completed ages ≥7; ages 5–34 were analysed separately, with the nested 7–34 group as a technical control and 35–59 and ≥60 as additional comparisons. We maintained a distinct reproduction of the historical continuous-age &gt;6 construction. Brazil 2014 and IBGE 2018 remained the primary standard and denominator revision. WHO, IBGE 2024, count models, Kitagawa decomposition and the selection and pandemic sensitivities were robustness or descriptive analyses; no multiple-testing correction was applied.</w:t>
+        <w:t>This secondary ecological analysis examined national underlying-cause asthma mortality in Brazil during 2014–2021. The corrected primary population comprised people aged ≥7 completed years. We analysed ages 5–34 separately and used the nested 7–34 group to assess sensitivity to ages five and six; 35–59 and ≥60 provided further comparisons. The historical analysis using continuous age &gt;6 was reproduced separately. The primary analysis retained IBGE 2018 denominators and Brazil 2014 standard weights. WHO, IBGE 2024, count models, Kitagawa decomposition and alternative selection and periods provided sensitivity or descriptive analyses. We applied no multiple-testing correction.</w:t>
       </w:r>
     </w:p>
     <w:p>
       <w:r>
-        <w:t>The reference was the 12-page PDF emailed to Amaury on 10 October 2026, SHA-256 fc552ab83d5254549fa4f1dfe880ab631a26c50bc8d861bfdc433331544e71fe, reconciled with a Word copy of concordant content and repository commit 3884c868a07164710a2e358180b3034f9cdcf642. Current official SIM archives were recovered and verified on 11 October 2026. Their historical selection and year-age aggregates exactly reproduced the versioned pipeline. Historical SIM hashes were available for 2020–2021, but not for the execution of 1 October in 2014–2019; numerical reproduction does not establish byte identity for the latter files.</w:t>
+        <w:t>We reconciled the archived 12-page manuscript of 10 October 2026 with a Word copy of concordant content and repository commit 3884c868a07164710a2e358180b3034f9cdcf642. Official SIM archives recovered on 11 October 2026 reproduced the versioned selection counts and year-age aggregates exactly. Historical execution hashes were available for SIM 2020–2021 only, so byte identity with the historical 2014–2019 files could not be established. The accompanying provenance manifest records the reference PDF hash and all verified input hashes.</w:t>
       </w:r>
     </w:p>
     <w:p>
@@ -122,12 +122,12 @@
     </w:p>
     <w:p>
       <w:r>
-        <w:t>Records were selected when CAUSABAS contained ICD-10 J45 or J46 [5]. The corrected COVID rule excluded the union of B342, U072, U071 or literal COVID-19 in LINHAA, LINHAB, LINHAC, LINHAD or LINHAII, retaining the historical five-field scope. Frequencies and overlapping code combinations were logged separately; overlapping mentions were counted once. The original rule without U071 and a rule retaining every COVID mention were separate sensitivities.</w:t>
+        <w:t>We selected records whose underlying cause field, CAUSABAS, contained ICD-10 J45 or J46 [5]. To retain the historical search scope, the corrected COVID rule searched LINHAA, LINHAB, LINHAC, LINHAD and LINHAII for B342, U072, U071 or literal COVID-19. A match in any field excluded the record once. We logged each code frequency and overlapping combination separately. Sensitivities used the original rule without U071 or retained all records with COVID mentions.</w:t>
       </w:r>
     </w:p>
     <w:p>
       <w:r>
-        <w:t>The historical reduced key comprised parsed death date, elapsed-days age, underlying cause and the five cause lines. It collapsed source rows 971828 and 971831 in 2018. Inspection of all available fields found differences in occupation and seven administrative fields (NUMEROLOTE, TPPOS, DTCADASTRO, DTRECEBIM, DTRECORIGA, DIFDATA and CONTADOR). The SIM dictionary describes NUMERODO as the death-declaration number, registration date as administrative, and receipt date as the latest central update [12]. NUMERODO is absent from these public CSVs. Matching dates, causes or administrative fields therefore could not establish that both rows describe one death. We retained both in the corrected principal and evaluated the historical-key collapse as a sensitivity, without asserting that the events are distinct or identical. No additional deduplication rule or linkage was invented.</w:t>
+        <w:t>The historical deduplication key combined parsed death date, elapsed-days age, underlying cause and the five cause lines. It collapsed 2018 source rows 971828 and 971831. Inspection of all public fields found differences in occupation and seven administrative fields (NUMEROLOTE, TPPOS, DTCADASTRO, DTRECEBIM, DTRECORIGA, DIFDATA and CONTADOR). The SIM dictionary identifies NUMERODO as the death-declaration number and describes registration and receipt dates as administrative information [12]. NUMERODO is absent from these CSVs. The available fields therefore do not establish whether the rows refer to the same death. We retained both in the primary analysis and assessed their collapse under the historical key as a sensitivity.</w:t>
       </w:r>
     </w:p>
     <w:p>
@@ -140,12 +140,12 @@
     </w:p>
     <w:p>
       <w:r>
-        <w:t>Completed age equalled death year minus birth year, minus one if the death preceded that year's anniversary. For a birth on 29 February, the anniversary in a non-leap year was 1 March. Seven-digit day-month-year strings received one leading zero; dates otherwise had to be eight digits and exactly valid in the calendar. Missing or non-interpretable dates and birth after death were excluded and logged separately. No upper-age exclusion was introduced. Ages 90 and above were grouped as 90+ to match IBGE.</w:t>
+        <w:t>Completed age was the difference between death and birth years, reduced by one if death preceded that year's birthday. For births on 29 February, the anniversary in a non-leap year was 1 March. We added a leading zero to seven-digit day-month-year strings and required an eight-digit valid calendar date. Missing or uninterpretable dates and birth after death were excluded and logged separately. We applied no upper-age exclusion and grouped ages ≥90 into the IBGE 90+ interval.</w:t>
       </w:r>
     </w:p>
     <w:p>
       <w:r>
-        <w:t>Calendar ages defined ≥7, 5–34, 7–34, 35–59 and ≥60. A sensitivity substituted days/365.25 and its floor for single-year bins. The historical reproduction retained its continuous &gt;6 threshold; it was not re-labelled ≥7 or merged with the corrected sample.</w:t>
+        <w:t>Calendar age defined the ≥7, 5–34, 7–34, 35–59 and ≥60 groups. One sensitivity used days/365.25, with its floor defining single-year bins. The historical reproduction retained the continuous &gt;6 threshold as a separate population.</w:t>
       </w:r>
     </w:p>
     <w:p>
@@ -158,12 +158,12 @@
     </w:p>
     <w:p>
       <w:r>
-        <w:t>Both-sex national single-year populations came from the 2018 IBGE revision [6], with the post-2022-Census 2024 revision as a sensitivity [7]. The 2018 workbook used the total-population block on sheet BR; the 2024 workbook used SIGLA = BR and SEXO = Ambos. Both provide ages 0–89 and the open 90+ interval. Each corrected crude numerator and denominator covered exactly the same domain. The historical crude reproduction instead divided continuous-age &gt;6 deaths by the entire population; a historical comparator used population ≥7, preserving its small age-domain mismatch for transparency.</w:t>
+        <w:t>National single-year populations for both sexes came from IBGE's 2018 revision [6]; the 2024 revision following the 2022 Census provided a sensitivity [7]. We used the total-population block on sheet BR in the 2018 workbook and SIGLA = BR with SEXO = Ambos in the 2024 workbook. Both provide ages 0–89 and an open 90+ interval. Corrected crude rates matched each numerator to the same population age range. To reproduce the historical construction, we divided continuous-age &gt;6 deaths by the entire population and separately by population ≥7. The latter comparator retains the small mismatch between its historical numerator and denominator.</w:t>
       </w:r>
     </w:p>
     <w:p>
       <w:r>
-        <w:t>For domain D and year t, direct standardisation was:</w:t>
+        <w:t>For age domain D and year t, we calculated the directly standardised rate as follows.</w:t>
       </w:r>
     </w:p>
     <w:p>
@@ -178,7 +178,7 @@
     </w:p>
     <w:p>
       <w:r>
-        <w:t>Weights were fixed across years and normalised separately within each domain, including 5–34 and 7–34. For each denominator revision, the Brazil-2014 standard was that revision's 2014 population. The 90+ deaths and population used a single matching open interval. WHO standardisation used five-year bands [8], adding the 90–94, 95–99 and ≥100 weights for 90+. For 7–9, three fifths of the WHO 5–9 weight was allocated before domain normalisation. This is a uniform-within-band approximation, not an observed age distribution. Missing death-count cells were filled with zero; population cells had to be complete and positive. Brazil-2014-standardised and aligned crude rates were checked for equality in 2014.</w:t>
+        <w:t>Weights were fixed across years and normalised separately within each age domain, including 5–34 and 7–34. Each denominator revision supplied its own Brazil 2014 standard population. Deaths and population at ≥90 shared one open interval. WHO standardisation used five-year bands [8], combining the 90–94, 95–99 and ≥100 weights for 90+. We allocated three fifths of the WHO 5–9 weight to 7–9 before normalisation, assuming a uniform distribution within that band. Missing death-count cells were assigned zero; population cells had to be complete and positive. We checked that Brazil-2014-standardised and aligned crude rates were equal in 2014.</w:t>
       </w:r>
     </w:p>
     <w:p>
@@ -191,17 +191,22 @@
     </w:p>
     <w:p>
       <w:r>
-        <w:t>National crude and Brazil-standardised annual rates used Gaussian-family GLMs; age-group and WHO-standardised rates used ordinary least squares. These identity-link Gaussian trends are numerically equivalent to OLS. Slopes were in deaths per 100,000 per year, with t intervals using n−2 residual degrees of freedom. Endpoint absolute and relative changes were reported separately from fitted annual slopes.</w:t>
+        <w:t>We fitted Gaussian-family GLMs to national crude and Brazil-standardised annual rates and ordinary least squares to age-group and WHO-standardised rates. The identity-link Gaussian trends are numerically equivalent to OLS. Slopes were expressed as deaths per 100,000 per year, with t intervals using n−2 residual degrees of freedom. We reported absolute and relative endpoint changes separately from annual slopes.</w:t>
       </w:r>
     </w:p>
     <w:p>
       <w:r>
-        <w:t>Count models used log-link Poisson, quasi-Poisson and negative binomial families [9]. For unadjusted domains, log E[Y(t)] = α + β × year(t) + log population(t). The national age-adjusted model was log E[Y(b,t)] = α + γ(b) + β × year(t) + log population(b,t), with nine categorical bands: 7–14 (reference), 15–24, 25–34, 35–44, 45–54, 55–64, 65–74, 75–84 and 85+. APC = 100 × (exp β − 1); intervals transformed β ± critical value × SE. Quasi-Poisson used the t distribution with model residual degrees of freedom; Poisson and negative binomial used normal Wald intervals. Quasi-Poisson scales the Poisson coefficient variance by estimated dispersion; negative binomial instead estimates a quadratic variance function μ + μ²/θ, which can also change coefficients. Pearson dispersion, θ, mean-model convergence, iterations, errors and warnings were recorded for every specification. A large θ with an iteration warning was reported as an approximation toward the Poisson limit, not exact equivalence or successful θ convergence.</w:t>
+        <w:t>Count models used log-link Poisson, quasi-Poisson and negative binomial families [9]. For unadjusted age domains, log E[Y(t)] = α + β × year(t) + log population(t). The national age-adjusted model was log E[Y(b,t)] = α + γ(b) + β × year(t) + log population(b,t). Its nine categorical bands were 7–14 (reference), 15–24, 25–34, 35–44, 45–54, 55–64, 65–74, 75–84 and 85+. Annual percentage change was APC = 100 × (exp β − 1), with intervals obtained by transforming β ± critical value × SE. Quasi-Poisson used the t distribution with model residual degrees of freedom; Poisson and negative binomial used normal Wald intervals.</w:t>
       </w:r>
     </w:p>
     <w:p>
       <w:r>
-        <w:t>Alongside the historical reference and corrected principal, one condition at a time was changed: elapsed-days age, original COVID rule, retention of all COVID mentions, historical deduplication key, exclusion of 2020, or restriction to 2014–2019. The latter two focused on 5–34 and 7–34. Actual calendar years were retained as covariates: exclusion of 2020 left seven observations and 5 trend residual degrees of freedom; 2014–2019 left six and 4. Both denominator revisions and both standards were evaluated, and no model was selected for statistical significance.</w:t>
+        <w:t>Quasi-Poisson scales Poisson coefficient variance by estimated dispersion. Negative binomial estimates the quadratic variance function μ + μ²/θ and can change coefficients as well as uncertainty. For every specification, we recorded Pearson dispersion, θ, mean-model convergence, iterations, errors and warnings. Large θ estimates with iteration warnings were interpreted as approaching the Poisson limit; these warnings prevent a claim of successful θ convergence or exact equivalence to Poisson.</w:t>
+      </w:r>
+    </w:p>
+    <w:p>
+      <w:r>
+        <w:t>Each sensitivity changed one condition from the corrected primary analysis. We examined elapsed-days age, the original COVID rule, retention of all COVID mentions, the historical deduplication key, exclusion of 2020 and restriction to 2014–2019. The last two focused on 5–34 and 7–34 and retained actual calendar years as covariates. Excluding 2020 left seven observations and 5 trend residual degrees of freedom; restriction to 2014–2019 left six and 4. We evaluated both denominator revisions and both standards and reported every model regardless of statistical significance.</w:t>
       </w:r>
     </w:p>
     <w:p>
@@ -214,7 +219,7 @@
     </w:p>
     <w:p>
       <w:r>
-        <w:t>For the same corrected ≥7 population, the symmetric Kitagawa decomposition [11] partitioned crude differences into composition C and age-specific-rate R terms:</w:t>
+        <w:t>For the corrected ≥7 population, symmetric Kitagawa decomposition [11] partitioned crude differences into an age-composition term C and an age-specific-rate term R.</w:t>
       </w:r>
     </w:p>
     <w:p>
@@ -234,7 +239,7 @@
     </w:p>
     <w:p>
       <w:r>
-        <w:t>The same six endpoint pairs were used with IBGE 2018 and 2024: 2014–2021, 2014–2019, 2014–2020, 2015–2021, 2016–2021 and 2014–2018. Full-precision identities were checked before rounding. Each displayed component was rounded independently, so the final displayed digit need not add exactly. Shares greater than 100% indicate an opposing negative rate term. This descriptive accounting does not identify causal mechanisms.</w:t>
+        <w:t>We used the same six endpoint pairs with IBGE 2018 and 2024, namely 2014–2021, 2014–2019, 2014–2020, 2015–2021, 2016–2021 and 2014–2018. We checked the identities at full precision before rounding each displayed component independently. This can produce a discrepancy in the last displayed digit. Shares above 100% indicate that a negative rate term offsets part of the composition term. The decomposition is descriptive and does not identify causal mechanisms.</w:t>
       </w:r>
     </w:p>
     <w:p>
@@ -247,17 +252,17 @@
     </w:p>
     <w:p>
       <w:r>
-        <w:t>Reproduction and revision used R 4.6.1 [10]; package versions, configurations, input hashes, warnings and independent checks accompany the code. R 4.3.3 was reported in the reference. Historical numerical differences under the current environment are documented without claiming an identical software stack. Public inputs, verified extraction code and isolated scenario outputs support reruns. The original repository is https://github.com/EduIntellect/asthma-mortality-brazil-reanalysis; this revision is prepared locally for author review and has not been published there.</w:t>
+        <w:t>We used R 4.6.1 [10] for reproduction and revision; the reference reported R 4.3.3. The code records package versions, configurations, input hashes, warnings and independent checks, including numerical differences under the current environment. Public inputs, verified extraction code and separate scenario outputs support reproduction. Code and revision outputs are available at https://github.com/EduIntellect/asthma-mortality-brazil-reanalysis/tree/revision/amaury-review .</w:t>
       </w:r>
     </w:p>
     <w:p>
       <w:r>
-        <w:t>Generative AI tools were used in the historical workflow (Claude Code and GitHub Copilot) and in this revision (Codex) for code, analysis checking and editorial drafting. Figures were plotted from results, not generated as AI images. This statement does not assert that both authors have completed their review or approved the revision.</w:t>
+        <w:t>The historical workflow used Claude Code and GitHub Copilot. This revision used Codex for code, analysis checking and editorial drafting. Figures were plotted directly from analytical results. Both authors' review and approval of the final work remain pending.</w:t>
       </w:r>
     </w:p>
     <w:p>
       <w:r>
-        <w:t>The study used public SIM mortality records and aggregate IBGE projections, with no participant contact. Only aggregate results are reported. No formally granted ethics approval or exemption is claimed; applicable institutional and journal wording requires author confirmation, as listed in the accompanying checklist.</w:t>
+        <w:t>The study used public SIM mortality records and aggregate IBGE projections, with no participant contact, and reports only aggregate results. Formal ethics approval or exemption has not been documented. The applicable institutional and journal wording requires author confirmation, as detailed in the accompanying checklist.</w:t>
       </w:r>
     </w:p>
     <w:p>
@@ -278,12 +283,12 @@
     </w:p>
     <w:p>
       <w:r>
-        <w:t>The complete historical pipeline reproduced 19,105 underlying-cause candidates, 56 COVID exclusions, one reduced-key removal, 15 non-interpretable ages and 18,583 deaths at continuous age &gt;6, versus 18,584 in Brum et al. [1]. All versioned selection counts, annual age aggregates and IBGE-2018 denominators matched exactly. Rate and trend differences were at floating-point scale; negative-binomial theta differed slightly under the current environment in models approaching the Poisson limit, without changing the reported significance classes. The unresolved original population series and age-group discrepancies remain in the historical audit (Supplementary Table S3).</w:t>
+        <w:t>The historical pipeline reproduced 19,105 underlying-cause candidates, 56 COVID exclusions, one reduced-key removal, 15 uninterpretable ages and 18,583 deaths at continuous age &gt;6. Brum et al. reported 18,584 deaths [1]. All versioned selection counts, annual age aggregates and IBGE-2018 denominators matched exactly. Rate and trend differences were at floating-point scale. Negative binomial θ estimates differed slightly under the current environment in models approaching the Poisson limit, with no change in significance classifications. Supplementary Table S3 documents the unresolved original population series and age-group discrepancies.</w:t>
       </w:r>
     </w:p>
     <w:p>
       <w:r>
-        <w:t>The eight official files contained 11,169,644 records, including 19,105 underlying-cause asthma records. Corrected COVID exclusions removed 57 records: 27 in 2020 and 30 in 2021. No record was removed as a proven duplicate; 15 had non-interpretable dates and none had birth after death, leaving 19,033 age-valid records. The ≥7 domain contained 18,544 deaths, including 12,678 (68.4%) at ≥60. Calendar age changed the single-year bin of 23 candidates (23 retained), but none crossed the ≥7, 5–34, 7–34, 35–59 or ≥60 domain boundaries relative to floor(days/365.25). Ages above 90 were retained in the 90+ interval. The corrected total ≥7 equals the historical total by coincidence: retaining one 2018 record adds a death and excluding the additional 2021 U071 record removes one.</w:t>
+        <w:t>The eight official files contained 11,169,644 records, including 19,105 underlying-cause asthma records. Corrected COVID exclusions removed 57 records, comprising 27 in 2020 and 30 in 2021. No record was removed as a proven duplicate; 15 had non-interpretable dates and none had birth after death, leaving 19,033 age-valid records. The ≥7 domain contained 18,544 deaths, including 12,678 (68.4%) at ≥60. Calendar age changed the single-year bin of 23 candidates (23 retained), but none crossed the ≥7, 5–34, 7–34, 35–59 or ≥60 domain boundaries relative to floor(days/365.25). Ages above 90 were retained in the 90+ interval. The corrected total ≥7 equals the historical total because retaining one 2018 record and excluding the additional 2021 U071 record cancel in the total.</w:t>
       </w:r>
     </w:p>
     <w:p>
@@ -296,12 +301,12 @@
     </w:p>
     <w:p>
       <w:r>
-        <w:t>For completed ages ≥7, the aligned crude series rose from 1.123 to 1.257 per 100,000 (+12.0%; absolute change +0.1343), with slope 0.0270 per year (95% CI 0.0030 to 0.0509; p = 0.033). Brazil-2014-standardised mortality changed from 1.123 to 1.077 per 100,000 (-4.1%; absolute change -0.0456), with slope 0.0002 per year (95% CI -0.0214 to 0.0217; p = 0.986). The endpoint decrease and the slope across eight annual observations answer different questions. The interval does not demonstrate equivalence to zero or stability.</w:t>
+        <w:t>For completed ages ≥7, the aligned crude series rose from 1.123 to 1.257 per 100,000 (+12.0%; absolute change +0.1343), with slope 0.0270 per year (95% CI 0.0030 to 0.0509; p = 0.033). Brazil-2014-standardised mortality changed from 1.123 to 1.077 per 100,000 (-4.1%; absolute change -0.0456), with slope 0.0002 per year (95% CI -0.0214 to 0.0217; p = 0.986). The endpoint comparison describes the difference between 2014 and 2021. The slope uses all eight annual observations, and its interval includes trends in both directions.</w:t>
       </w:r>
     </w:p>
     <w:p>
       <w:r>
-        <w:t>With 2018 denominators, the age-adjusted national estimate was +0.00% per year (95% CI -1.13 to 1.14; p = 0.999) under quasi-Poisson and +0.93% per year (95% CI -0.20 to 2.06; p = 0.106) under negative binomial regression. With 2024 denominators, the negative binomial estimate was +1.14% per year (95% CI 0.03 to 2.26; p = 0.044), the only one of the six corrected national age-adjusted specifications with an interval excluding zero. The national Poisson Pearson dispersion was 3.11; different uncertainty and variance assumptions contribute to differences between families. All mean-model iterations converged. Negative binomial fits for some unadjusted age-group series issued theta iteration-limit warnings; these rows are reported explicitly in Supplementary Table S4, not treated as successful dispersion convergence or exact identity with Poisson.</w:t>
+        <w:t>With 2018 denominators, the age-adjusted national estimate was +0.00% per year (95% CI -1.13 to 1.14; p = 0.999) under quasi-Poisson and +0.93% per year (95% CI -0.20 to 2.06; p = 0.106) under negative binomial regression. With 2024 denominators, the negative binomial estimate was +1.14% per year (95% CI 0.03 to 2.26; p = 0.044), the only one of the six corrected national age-adjusted specifications whose interval excluded zero. The national Poisson Pearson dispersion was 3.11; different uncertainty and variance assumptions contribute to differences between families. All mean-model iterations converged. Some unadjusted age-group negative binomial fits reached the theta iteration limit. Supplementary Table S4 identifies these warnings; convergence of the mean model alone does not establish dispersion convergence.</w:t>
       </w:r>
     </w:p>
     <w:p>
@@ -314,7 +319,7 @@
     </w:p>
     <w:p>
       <w:r>
-        <w:t>Across six pairs, the composition component was positive under both revisions. With IBGE 2018 it accounted for 61.5–193.8% of the net increase, compared with 55.0–153.5% under IBGE 2024. For 2014–2021, the 2018 net change of +0.134 per 100,000 comprised composition +0.191 and age-specific rates -0.057; 94.8% of composition arose at ≥60. The corresponding 2024 terms were +0.146, +0.170 and -0.025. Contributions above 100% mean that a negative rate component partly offset the positive composition component; they are accounting quantities, not causal fractions.</w:t>
+        <w:t>Across six pairs, the composition component was positive under both revisions. With IBGE 2018 it accounted for 61.5–193.8% of the net increase, compared with 55.0–153.5% under IBGE 2024. For 2014–2021, the 2018 net change of +0.134 per 100,000 comprised composition +0.191 and age-specific rates -0.057; 94.8% of composition arose at ≥60. The corresponding 2024 terms were +0.146, +0.170 and -0.025. Contributions above 100% mean that a negative rate component partly offset the positive composition component; these proportions describe the decomposition and do not estimate causal effects.</w:t>
       </w:r>
     </w:p>
     <w:p>
@@ -327,12 +332,12 @@
     </w:p>
     <w:p>
       <w:r>
-        <w:t>Ages 5–34 contributed 1,590 corrected deaths (172–236 annually). Their crude rate rose from 0.182 to 0.218 per 100,000 (+19.7%; absolute change +0.0358), with slope 0.0079 per year (95% CI 0.0021 to 0.0138; p = 0.016). Standardising within 5–34 to Brazil 2014 yielded 0.182 to 0.215 per 100,000 (+18.0%; absolute change +0.0328), with slope 0.0075 per year (95% CI 0.0018 to 0.0132; p = 0.018); WHO standardisation yielded 0.178 to 0.207 per 100,000 (+16.4%; absolute change +0.0291), with slope 0.0068 per year (95% CI 0.0014 to 0.0122; p = 0.022). Thus the crude absolute increase was 0.0358, and the within-group-standardised absolute increase was 0.0328 per 100,000. The nested 7–34 control gave 0.181 to 0.220 per 100,000 (+21.0%; absolute change +0.0381), with slope 0.0088 per year (95% CI 0.0026 to 0.0149; p = 0.013); it is a technical control, not independent replication. The crude 5–34 quasi-Poisson estimate was +4.00% per year (95% CI 1.13 to 6.95; p = 0.014).</w:t>
+        <w:t>Ages 5–34 contributed 1,590 corrected deaths (172–236 annually). Their crude rate rose from 0.182 to 0.218 per 100,000 (+19.7%; absolute change +0.0358), with slope 0.0079 per year (95% CI 0.0021 to 0.0138; p = 0.016). Standardising within 5–34 to Brazil 2014 yielded 0.182 to 0.215 per 100,000 (+18.0%; absolute change +0.0328), with slope 0.0075 per year (95% CI 0.0018 to 0.0132; p = 0.018); WHO standardisation yielded 0.178 to 0.207 per 100,000 (+16.4%; absolute change +0.0291), with slope 0.0068 per year (95% CI 0.0014 to 0.0122; p = 0.022). Thus the crude absolute increase was 0.0358, and the within-group-standardised absolute increase was 0.0328 per 100,000. The nested 7–34 comparison gave 0.181 to 0.220 per 100,000 (+21.0%; absolute change +0.0381), with slope 0.0088 per year (95% CI 0.0026 to 0.0149; p = 0.013); it tests sensitivity to including ages five and six. The crude 5–34 quasi-Poisson estimate was +4.00% per year (95% CI 1.13 to 6.95; p = 0.014).</w:t>
       </w:r>
     </w:p>
     <w:p>
       <w:r>
-        <w:t>Excluding 2020 while retaining calendar-year values, the within-5–34 Brazil-2014-standardised slope was 0.0058 (95% CI 0.0004 to 0.0112; p = 0.040). In 2014–2019 it was 0.0068 (95% CI -0.0023 to 0.0158; p = 0.107); the endpoint increase was 22.4%. For the 7–34 control, the respective standardised trend p values were 0.021 and 0.067. The primary standardised prepandemic interval therefore does not establish a positive annual trend. With WHO standardisation and IBGE 2018, excluding 2020 gives p = 0.055, with an interval including zero. In 2014–2019, count-model inference also differs: the crude 5–34 Poisson and negative-binomial Wald intervals exclude zero, whereas the quasi-Poisson t interval includes it; negative-binomial theta has an iteration warning. Results for both revisions, both standards and count models are supplied rather than selected by significance.</w:t>
+        <w:t>Excluding 2020 while retaining calendar-year values, the within-5–34 Brazil-2014-standardised slope was 0.0058 (95% CI 0.0004 to 0.0112; p = 0.040). In 2014–2019 it was 0.0068 (95% CI -0.0023 to 0.0158; p = 0.107); the endpoint increase was 22.4%. For the 7–34 control, the respective standardised trend p values were 0.021 and 0.067. The primary standardised prepandemic interval therefore does not establish a positive annual trend. With WHO standardisation and IBGE 2018, excluding 2020 gives p = 0.055, with an interval including zero. In 2014–2019, count-model inference also differs. The crude 5–34 Poisson and negative binomial Wald intervals exclude zero; the quasi-Poisson t interval includes it; negative-binomial theta has an iteration warning. Supplementary Table S7 reports results for both revisions, both standards and all three count families.</w:t>
       </w:r>
     </w:p>
     <w:p>
@@ -350,32 +355,42 @@
     </w:p>
     <w:p>
       <w:r>
-        <w:t>The corrected analysis reproduced the historical crude finding while separating it from the national domain of completed ages ≥7. Aligned crude mortality increased between 2014 and 2021, but the Brazil-2014-standardised endpoint change was negative and the slope across all eight years was close to zero. Its uncertainty admits trends in either direction and cannot demonstrate stability. The positive negative-binomial estimate using IBGE 2024 also prevents a claim that all national age-adjusted specifications exclude an increase.</w:t>
+        <w:t>The corrected analysis found an increase in aligned crude asthma mortality among people aged ≥7 between 2014 and 2021. With Brazil 2014 age weights held fixed, the endpoint change was negative and the slope across all eight years was close to zero. The interval was compatible with trends in either direction and does not demonstrate stability. The positive age-adjusted negative binomial estimate with IBGE 2024 shows that national trend inference also depends on the model and population revision.</w:t>
       </w:r>
     </w:p>
     <w:p>
       <w:r>
-        <w:t>The decomposition showed positive age-composition contributions across every endpoint pair with both denominator revisions. For some pairs the composition term exceeded the net crude increase because the age-specific-rate term was negative. These quantities describe changes in rates and population composition rather than identify causes of death, certification changes, treatment access or pandemic effects. Endpoint contrasts should not substitute for the trend across all annual observations.</w:t>
+        <w:t>Age composition contributed positively to the crude change for every endpoint pair under both population revisions. In some pairs, the composition term exceeded the net increase because the age-specific-rate term was negative. The decomposition explains how population composition and rates combine arithmetically; it cannot identify effects of death certification, treatment access or the pandemic. Endpoint comparisons and slopes across all annual observations describe different aspects of the series.</w:t>
       </w:r>
     </w:p>
     <w:p>
       <w:r>
-        <w:t>Within ages 5–34, both crude and standardised mortality increased across 2014–2021. Standardising inside the range matters because even a comparatively young domain can change its internal age distribution. The primary Brazil-standardised slope retained a positive interval after removal of 2020, while the WHO sensitivity with IBGE 2018 included zero. The shorter prepandemic primary estimate was imprecise and its interval included zero. Neither that imprecision nor the positive endpoint contrast establishes a prepandemic annual trend. The nested 7–34 analysis supports sensitivity to the inclusion of ages five and six, rather than independent confirmation. These findings warrant continued surveillance but do not establish a change point or a reversal of the earlier decline reported by Graudenz et al. [3].</w:t>
+        <w:t>Both crude and standardised mortality within ages 5–34 increased over 2014–2021. Standardising within this range accounts for changes in its internal age distribution. The primary Brazil-standardised slope retained a positive interval after excluding 2020; the corresponding WHO sensitivity with IBGE 2018 included zero. The nested 7–34 analysis assesses how including ages five and six affects the estimate and does not provide independent replication.</w:t>
       </w:r>
     </w:p>
     <w:p>
       <w:r>
-        <w:t>The U071 correction, explicit calendar ages and conservative treatment of the ambiguous pair improve the transparency of selection. Equality of the revised and historical ≥7 totals masks different individual records and distributions. Calendar age shifted single-year bins even without changing the five named domain memberships, which can affect direct standardisation and band-based models. Alternative COVID rules, retention of mentions and key-based deduplication are reported as sensitivity scenarios rather than silently blended corrections.</w:t>
+        <w:t>The shorter prepandemic primary estimate was imprecise and its interval included zero. Its positive endpoint contrast alone does not establish an annual trend over 2014–2019. The observed increase over 2014–2021 warrants continued surveillance, while differences in study periods and age definitions prevent identification of a change point or reversal of the earlier decline reported by Graudenz et al. [3].</w:t>
       </w:r>
     </w:p>
     <w:p>
       <w:r>
-        <w:t>Limitations include the ecological design, short annual series, post hoc robustness analyses, unadjusted multiple comparisons and possible changes in death certification. Public-field linkage cannot determine the true identity of the 2018 pair. For SIM 2014–2019, absent historical execution hashes prevent verification of byte identity, despite exact reproduction of recorded counts and aggregates. The population workbook used by Brum et al. remains unavailable. Negative-binomial theta iteration warnings near the Poisson limit also limit claims about dispersion convergence; they do not justify hiding models or selecting a family by its p value. Statistical intervals quantify model uncertainty rather than uncertainty from record selection, certification or population reconstruction.</w:t>
+        <w:t>The selection audit shows why equal ≥7 totals need not represent the same records. Retaining one ambiguous 2018 record and excluding one additional U071 record in 2021 cancel in the total. Calendar age also changed single-year bins without changing membership in the five age domains, affecting the age distribution used in standardisation and count models. Separate sensitivities identify the effect of each alternative selection rule.</w:t>
       </w:r>
     </w:p>
     <w:p>
       <w:r>
-        <w:t>The study supports joint reporting of aligned crude, age-standardised and age-specific mortality. Population composition accounted for much of the corrected crude increase at ≥7. Evidence of an increase within 5–34 over 2014–2021 merits attention, with the prepandemic uncertainty and sensitivity to modelling clearly stated.</w:t>
+        <w:t>The ecological design, short annual series, post hoc sensitivity analyses, unadjusted multiple comparisons and possible changes in death certification limit interpretation. Public fields cannot establish whether the 2018 pair represents one death. Historical execution hashes for SIM 2014–2019 and the population workbook used by Brum et al. remain unavailable. Exact reproduction of recorded counts and aggregates therefore cannot establish historical file identity.</w:t>
+      </w:r>
+    </w:p>
+    <w:p>
+      <w:r>
+        <w:t>Negative binomial θ iteration warnings near the Poisson limit limit confidence in dispersion estimation. We retained every model and its warnings to make these limitations visible. Statistical intervals quantify model uncertainty; they do not capture uncertainty in record selection, certification or population reconstruction.</w:t>
+      </w:r>
+    </w:p>
+    <w:p>
+      <w:r>
+        <w:t>These findings support reporting aligned crude, age-standardised and age-specific mortality together. Age composition accounted for much of the crude increase among people aged ≥7. The increase within 5–34 over 2014–2021 merits attention, with interpretation bounded by prepandemic uncertainty and sensitivity to model assumptions.</w:t>
       </w:r>
     </w:p>
     <w:p>

</xml_diff>

<commit_message>
Apply five manuscript structure revisions
</commit_message>
<xml_diff>
--- a/revision/deliverables/Manuscript_CLEAN.docx
+++ b/revision/deliverables/Manuscript_CLEAN.docx
@@ -40,7 +40,7 @@
     </w:p>
     <w:p>
       <w:r>
-        <w:t>Methods. We reproduced the historical analysis and revised record selection using completed calendar age, COVID exclusions including U071, and retention of two 2018 records whose identity could not be established. The primary analysis used IBGE 2018 denominators and Brazil 2014 standard weights, normalised within each age range. Sensitivities examined IBGE 2024, WHO weights, count models, alternative selection rules and pandemic-period restrictions.</w:t>
+        <w:t>Methods. We reproduced the historical analysis and revised record selection using completed calendar age, COVID exclusions including U071, and retention of two 2018 records whose identity could not be established. The primary analysis used IBGE 2018 denominators and Brazil 2014 standard weights, normalised within each age range. Kitagawa decomposition described the contributions of age composition and age-specific rates to changes in crude mortality. Sensitivities examined IBGE 2024, WHO weights, count models, alternative selection rules and pandemic-period restrictions.</w:t>
       </w:r>
     </w:p>
     <w:p>
@@ -83,7 +83,7 @@
     </w:p>
     <w:p>
       <w:r>
-        <w:t>We examined whether the reported increase in Brazilian asthma mortality during 2014–2021 persisted when population age structure was held fixed. We first reproduced Brum et al.'s analysis and documented agreements and discrepancies with the published results. We then estimated national rates among people aged ≥7 years and rates within ages 5–34, standardising separately within each range. Post hoc sensitivity analyses examined alternative population projections, WHO weights, count models, selection rules and pandemic-period restrictions. These analyses distinguish the observed crude increase from the national and age-specific trends supported by the data.</w:t>
+        <w:t>We examined whether the reported increase in Brazilian asthma mortality during 2014–2021 persisted when population age structure was held fixed. We first reproduced Brum et al.'s analysis and documented agreements and discrepancies with the published results. We then estimated national rates among people aged ≥7 years and rates within ages 5–34, standardising separately within each range. We also used Kitagawa decomposition to describe the contributions of changes in age composition and age-specific rates to the crude-rate change. Post hoc sensitivity analyses examined alternative population projections, WHO weights, count models, selection rules and pandemic-period restrictions. These analyses distinguish the observed crude increase from the national and age-specific trends supported by the data.</w:t>
       </w:r>
     </w:p>
     <w:p>
@@ -109,7 +109,7 @@
     </w:p>
     <w:p>
       <w:r>
-        <w:t>We reconciled the archived 12-page manuscript of 10 October 2026 with a Word copy of concordant content and repository commit 3884c868a07164710a2e358180b3034f9cdcf642. Official SIM archives recovered on 11 October 2026 reproduced the versioned selection counts and year-age aggregates exactly. Historical execution hashes were available for SIM 2020–2021 only, so byte identity with the historical 2014–2019 files could not be established. The accompanying provenance manifest records the reference PDF hash and all verified input hashes.</w:t>
+        <w:t>We reproduced the historical analysis against the archived manuscript and versioned analytical code. Provenance details are reported under Software, reproducibility and ethics.</w:t>
       </w:r>
     </w:p>
     <w:p>
@@ -257,6 +257,11 @@
     </w:p>
     <w:p>
       <w:r>
+        <w:t>We reconciled the archived 12-page manuscript of 10 October 2026 with a Word copy of concordant content and repository commit 3884c868a07164710a2e358180b3034f9cdcf642. Official SIM archives recovered on 11 October 2026 reproduced the versioned selection counts and year-age aggregates exactly. Historical execution hashes were available for SIM 2020–2021 only, so byte identity with the historical 2014–2019 files could not be established. The accompanying provenance manifest records the reference PDF hash and all verified input hashes.</w:t>
+      </w:r>
+    </w:p>
+    <w:p>
+      <w:r>
         <w:t>The historical workflow used Claude Code and GitHub Copilot. This revision used Codex for code, analysis checking and editorial drafting. Figures were plotted directly from analytical results. Both authors' review and approval of the final work remain pending.</w:t>
       </w:r>
     </w:p>
@@ -337,7 +342,12 @@
     </w:p>
     <w:p>
       <w:r>
-        <w:t>Excluding 2020 while retaining calendar-year values, the within-5–34 Brazil-2014-standardised slope was 0.0058 (95% CI 0.0004 to 0.0112; p = 0.040). In 2014–2019 it was 0.0068 (95% CI -0.0023 to 0.0158; p = 0.107); the endpoint increase was 22.4%. For the 7–34 control, the respective standardised trend p values were 0.021 and 0.067. The primary standardised prepandemic interval therefore does not establish a positive annual trend. With WHO standardisation and IBGE 2018, excluding 2020 gives p = 0.055, with an interval including zero. In 2014–2019, count-model inference also differs. The crude 5–34 Poisson and negative binomial Wald intervals exclude zero; the quasi-Poisson t interval includes it; negative-binomial theta has an iteration warning. Supplementary Table S7 reports results for both revisions, both standards and all three count families.</w:t>
+        <w:t>Excluding 2020 while retaining calendar-year values, the within-5–34 Brazil-2014-standardised slope was 0.0058 (95% CI 0.0004 to 0.0112; p = 0.040). In 2014–2019 it was 0.0068 (95% CI -0.0023 to 0.0158; p = 0.107); the endpoint increase was 22.4%. For the 7–34 control, the respective standardised trend p values were 0.021 and 0.067. The primary standardised prepandemic interval therefore does not establish a positive annual trend.</w:t>
+      </w:r>
+    </w:p>
+    <w:p>
+      <w:r>
+        <w:t>With WHO standardisation and IBGE 2018, excluding 2020 gives p = 0.055, with an interval including zero. In 2014–2019, count-model inference also differs. The crude 5–34 Poisson and negative binomial Wald intervals exclude zero; the quasi-Poisson t interval includes it; negative-binomial theta has an iteration warning. Supplementary Table S7 reports results for both revisions, both standards and all three count families. These comparisons show that inference depends on the standard and variance assumptions.</w:t>
       </w:r>
     </w:p>
     <w:p>
@@ -365,17 +375,17 @@
     </w:p>
     <w:p>
       <w:r>
-        <w:t>Both crude and standardised mortality within ages 5–34 increased over 2014–2021. Standardising within this range accounts for changes in its internal age distribution. The primary Brazil-standardised slope retained a positive interval after excluding 2020; the corresponding WHO sensitivity with IBGE 2018 included zero. The nested 7–34 analysis assesses how including ages five and six affects the estimate and does not provide independent replication.</w:t>
+        <w:t>Both crude and standardised mortality within ages 5–34 increased over 2014–2021. Standardising within this range accounts for changes in its internal age distribution. The nested 7–34 analysis assesses how including ages five and six affects the estimate and does not provide independent replication.</w:t>
       </w:r>
     </w:p>
     <w:p>
       <w:r>
-        <w:t>The shorter prepandemic primary estimate was imprecise and its interval included zero. Its positive endpoint contrast alone does not establish an annual trend over 2014–2019. The observed increase over 2014–2021 warrants continued surveillance, while differences in study periods and age definitions prevent identification of a change point or reversal of the earlier decline reported by Graudenz et al. [3].</w:t>
+        <w:t>Extension of the finding across periods depends on the analysis. The primary Brazil-standardised slope retained a positive interval after excluding 2020; the corresponding WHO sensitivity with IBGE 2018 included zero. The shorter prepandemic primary estimate was imprecise and its interval included zero. Its positive endpoint contrast alone does not establish an annual trend over 2014–2019. The observed increase over 2014–2021 warrants continued surveillance, while differences in study periods and age definitions prevent identification of a change point or reversal of the earlier decline reported by Graudenz et al. [3].</w:t>
       </w:r>
     </w:p>
     <w:p>
       <w:r>
-        <w:t>The selection audit shows why equal ≥7 totals need not represent the same records. Retaining one ambiguous 2018 record and excluding one additional U071 record in 2021 cancel in the total. Calendar age also changed single-year bins without changing membership in the five age domains, affecting the age distribution used in standardisation and count models. Separate sensitivities identify the effect of each alternative selection rule.</w:t>
+        <w:t>Interpretation also depends on which records enter each analysis. The selection audit shows why equal ≥7 totals need not represent the same records. Retaining one ambiguous 2018 record and excluding one additional U071 record in 2021 cancel in the total. Calendar age also changed single-year bins without changing membership in the five age domains, affecting the age distribution used in standardisation and count models. Separate sensitivities identify the effect of each alternative selection rule.</w:t>
       </w:r>
     </w:p>
     <w:p>

</xml_diff>

<commit_message>
Polish RRCP proof and document remaining ethics gate
</commit_message>
<xml_diff>
--- a/revision/deliverables/Manuscript_CLEAN.docx
+++ b/revision/deliverables/Manuscript_CLEAN.docx
@@ -50,7 +50,7 @@
     </w:p>
     <w:p>
       <w:r>
-        <w:t>Conclusions. Changes in population age composition accounted for much of the crude increase at ages ≥7 in a descriptive decomposition. The primary national age-standardised estimate was compatible with trends in either direction. Standardisation within 5–34 supported an increase over 2014–2021 and after excluding 2020; the shorter prepandemic series remained inconclusive about the annual trend. Surveillance should report crude, age-standardised and age-specific rates together.</w:t>
+        <w:t>Conclusions. Changes in population age composition accounted for much of the crude increase at ages ≥7 in a descriptive decomposition. The primary national age-standardised estimate was compatible with trends in either direction. Within 5–34, primary Brazil-2014 standardisation supported an increase over 2014–2021 and after excluding 2020; the shorter prepandemic series remained inconclusive about the annual trend. Surveillance should report crude, age-standardised and age-specific rates together.</w:t>
       </w:r>
     </w:p>
     <w:p>
@@ -68,7 +68,7 @@
     </w:p>
     <w:p>
       <w:r>
-        <w:t>One nationwide study concluded that "asthma mortality remains high and shows an increasing trend for the first time in the past decades" [1]. Their nationwide analysis for 2014–2021 identified 18,584 asthma deaths and reported an annual increase of approximately 2.5%. Another study of 2013–2023 concluded that asthma-related deaths had increased [2]. They based this conclusion on annual death counts and reported a stable overall mortality rate per 100,000 habitants. These measures describe different aspects of mortality. Neither establishes an increase in the national age-standardised rate.</w:t>
+        <w:t>One nationwide study concluded that "asthma mortality remains high and shows an increasing trend for the first time in the past decades" [1]. That analysis for 2014–2021 identified 18,584 asthma deaths and reported an annual increase of approximately 2.5%. Another study of 2013–2023 concluded that asthma-related deaths had increased [2]. The latter conclusion relied on annual death counts, although the overall mortality rate per 100,000 inhabitants was reported as stable. These measures describe different aspects of mortality. Neither establishes an increase in the national age-standardised rate.</w:t>
       </w:r>
     </w:p>
     <w:p>
@@ -342,7 +342,7 @@
         <w:pStyle w:val="Heading2"/>
       </w:pPr>
       <w:r>
-        <w:t>Mortality within ages 5–34 and sensitivity analyses</w:t>
+        <w:t>Age-domain mortality and sensitivity analyses</w:t>
       </w:r>
     </w:p>
     <w:p>
@@ -362,7 +362,12 @@
     </w:p>
     <w:p>
       <w:r>
-        <w:t>The original COVID rule removes 56 records; adding U071 removes one further record in 2021, within both young domains. Of 18 U071 mentions in 2020, all were already excluded; of 19 in 2021, 18 overlapped the original rule. Retaining all COVID mentions raises the primary ≥7 numerator from 18,544 to 18,601. Calendar-age, original-COVID, all-COVID-retained and historical-key sensitivities change one condition at a time (Supplementary Table S8). At 35–59 the crude slope remained imprecise (p = 0.132); uncertainty is not evidence of stability.</w:t>
+        <w:t>The original COVID rule removes 56 records; adding U071 removes one further record in 2021, within both young domains. Of 18 U071 mentions in 2020, all were already excluded; of 19 in 2021, 18 overlapped the original rule. Retaining all COVID mentions raises the primary ≥7 numerator from 18,544 to 18,601. Calendar-age, original-COVID, all-COVID-retained and historical-key sensitivities change one condition at a time (Supplementary Table S8).</w:t>
+      </w:r>
+    </w:p>
+    <w:p>
+      <w:r>
+        <w:t>At 35–59 the crude slope remained imprecise (p = 0.132); uncertainty is not evidence of stability.</w:t>
       </w:r>
     </w:p>
     <w:p>
@@ -375,12 +380,12 @@
     </w:p>
     <w:p>
       <w:r>
-        <w:t>The corrected analysis found an increase in aligned crude asthma mortality among people aged ≥7 between 2014 and 2021. With Brazil 2014 age weights held fixed, the endpoint change was negative and the slope across all eight years was close to zero. The interval was compatible with trends in either direction and does not demonstrate stability. The positive age-adjusted negative binomial estimate with IBGE 2024 shows that national trend inference also depends on the model and population revision.</w:t>
+        <w:t>The corrected analysis found an increase in aligned crude asthma mortality among people aged ≥7 between 2014 and 2021. With Brazil 2014 age weights held fixed, the endpoint change was negative and the slope across all eight years was close to zero. Endpoint comparisons and slopes across all annual observations describe different aspects of the series. The interval was compatible with trends in either direction and does not demonstrate stability. The positive age-adjusted negative binomial estimate with IBGE 2024 shows that national trend inference also depends on the model and population revision.</w:t>
       </w:r>
     </w:p>
     <w:p>
       <w:r>
-        <w:t>Age composition contributed positively to the crude change for every endpoint pair under both population revisions. In some pairs, the composition term exceeded the net increase because the age-specific-rate term was negative. The decomposition combines composition and rates arithmetically; it cannot identify effects of certification, treatment access or the pandemic. Endpoint comparisons and slopes across all annual observations describe different aspects of the series.</w:t>
+        <w:t>Age composition contributed positively to the crude change for every endpoint pair under both population revisions. In some pairs, the composition term exceeded the net increase because the age-specific-rate term was negative. The decomposition combines composition and rates arithmetically; it cannot identify effects of certification, treatment access or the pandemic.</w:t>
       </w:r>
     </w:p>
     <w:p>
@@ -405,7 +410,7 @@
     </w:p>
     <w:p>
       <w:r>
-        <w:t>Negative binomial θ iteration warnings near the Poisson limit limit confidence in dispersion estimation. We retained every model and its warnings to make these limitations visible. Statistical intervals quantify model uncertainty; they do not capture uncertainty in record selection, certification or population reconstruction.</w:t>
+        <w:t>Negative binomial θ iteration warnings near the Poisson limit constrain confidence in dispersion estimation. We retained every model and its warnings to make these limitations visible. Statistical intervals quantify model uncertainty; they do not capture uncertainty in record selection, certification or population reconstruction.</w:t>
       </w:r>
     </w:p>
     <w:p>

</xml_diff>